<commit_message>
link pentru site lmarketanalysis
</commit_message>
<xml_diff>
--- a/idei/labour_market_analysis_.docx
+++ b/idei/labour_market_analysis_.docx
@@ -698,6 +698,12 @@
       </w:pPr>
       <w:r>
         <w:t>Broader economic factors such as GDP growth, inflation rates, and business investment trends are considered as they significantly impact labor market conditions. These indicators help in understanding the overall economic context in which the labor market operates.</w:t>
+      </w:r>
+    </w:p>
+    <w:p/>
+    <w:p>
+      <w:r>
+        <w:t>https://www.qualee.com/hr-glossary/labor-market-analysis</w:t>
       </w:r>
     </w:p>
     <w:sectPr>
@@ -1433,6 +1439,7 @@
   <w:style w:type="character" w:default="1" w:styleId="DefaultParagraphFont">
     <w:name w:val="Default Paragraph Font"/>
     <w:uiPriority w:val="1"/>
+    <w:semiHidden/>
     <w:unhideWhenUsed/>
   </w:style>
   <w:style w:type="table" w:default="1" w:styleId="TableNormal">

</xml_diff>